<commit_message>
docs: align Unit I materials with course checklist
</commit_message>
<xml_diff>
--- a/docs/entrega_u1/editables/2_Informe.docx
+++ b/docs/entrega_u1/editables/2_Informe.docx
@@ -32,7 +32,7 @@
         <w:jc w:val="center"/>
       </w:pPr>
       <w:r>
-        <w:t>ASTRO-TRAZOS</w:t>
+        <w:t>1. ASTRO-TRAZOS</w:t>
       </w:r>
     </w:p>
     <w:p>
@@ -64,6 +64,11 @@
     </w:p>
     <w:p>
       <w:r>
+        <w:t>Roles propuestos para la exposición: Max — integración y programación; Neil — diseño pedagógico y pruebas; Allcca — arte e interfaz. Confirmar distribución real con el grupo.</w:t>
+      </w:r>
+    </w:p>
+    <w:p>
+      <w:r>
         <w:t>Docente: Mtro. Jhamer Anderson Rojas Silva.</w:t>
       </w:r>
     </w:p>
@@ -85,7 +90,7 @@
         <w:pStyle w:val="Heading1"/>
       </w:pPr>
       <w:r>
-        <w:t>1. Resumen</w:t>
+        <w:t>2. Resumen</w:t>
       </w:r>
     </w:p>
     <w:p>
@@ -98,7 +103,7 @@
         <w:pStyle w:val="Heading1"/>
       </w:pPr>
       <w:r>
-        <w:t>2. Introducción</w:t>
+        <w:t>3. Introducción</w:t>
       </w:r>
     </w:p>
     <w:p>
@@ -116,7 +121,7 @@
         <w:pStyle w:val="Heading1"/>
       </w:pPr>
       <w:r>
-        <w:t>3. Marco teórico</w:t>
+        <w:t>4. Marco teórico</w:t>
       </w:r>
     </w:p>
     <w:p>
@@ -126,7 +131,22 @@
     </w:p>
     <w:p>
       <w:r>
+        <w:t>p′ = T(x,y) · R(θ) · S(sx,sy) · p.                                           (1)</w:t>
+      </w:r>
+    </w:p>
+    <w:p>
+      <w:r>
         <w:t>Una colisión entre segmentos se calcula con parámetros p + t·r y q + u·s. Cuando el producto cruzado de r y s es distinto de cero y t,u pertenecen a [0,1], existe un cruce. Una caja envolvente AABB descarta pares imposibles antes de calcular la intersección precisa. Para un rectángulo, A = base × altura; las longitudes del nivel se expresan en unidades de la escena, no en centímetros físicos.</w:t>
+      </w:r>
+    </w:p>
+    <w:p>
+      <w:r>
+        <w:t>t = ((q − p) × s) / (r × s),    u = ((q − p) × r) / (r × s).                    (2)</w:t>
+      </w:r>
+    </w:p>
+    <w:p>
+      <w:r>
+        <w:t>A = base × altura; 40 u × 30 u = 1200 u².                                  (3)</w:t>
       </w:r>
     </w:p>
     <w:p>
@@ -134,12 +154,17 @@
         <w:pStyle w:val="Heading1"/>
       </w:pPr>
       <w:r>
-        <w:t>4. Análisis y diseño</w:t>
+        <w:t>5. Análisis y diseño</w:t>
       </w:r>
     </w:p>
     <w:p>
       <w:r>
         <w:t>Beneficiarios previstos: escolares de 9 a 12 años. La interacción principal usa ratón, táctil o lápiz. Los trazos imperfectos se aproximan a la primitiva del nivel: segmento, rectángulo en pasos de 5 u, hexágono o curva orbital. El ejemplo visual enseña una solución posible sin gastar tinta y sin completar el nivel. Al soltar el pincel se evalúa el intento y se activa la simulación aunque falle.</w:t>
+      </w:r>
+    </w:p>
+    <w:p>
+      <w:r>
+        <w:t>Tabla 1. Relación entre las escenas y los conceptos. Fuente: elaboración propia a partir del juego.</w:t>
       </w:r>
     </w:p>
     <w:tbl>
@@ -459,7 +484,7 @@
           <w:i/>
           <w:sz w:val="18"/>
         </w:rPr>
-        <w:t>Figura 1. Menú real de la versión evaluada.</w:t>
+        <w:t>Figura 1. Menú real de la versión evaluada. Fuente: captura propia, 20/10/2026.</w:t>
       </w:r>
     </w:p>
     <w:p>
@@ -467,7 +492,7 @@
         <w:pStyle w:val="Heading1"/>
       </w:pPr>
       <w:r>
-        <w:t>5. Implementación</w:t>
+        <w:t>6. Implementación</w:t>
       </w:r>
     </w:p>
     <w:p>
@@ -528,7 +553,7 @@
           <w:i/>
           <w:sz w:val="18"/>
         </w:rPr>
-        <w:t>Figura 2. Medidas de base, altura y área durante la construcción.</w:t>
+        <w:t>Figura 2. Medidas de base, altura y área durante la construcción. Fuente: captura propia, 20/10/2026.</w:t>
       </w:r>
     </w:p>
     <w:p>
@@ -536,12 +561,17 @@
         <w:pStyle w:val="Heading1"/>
       </w:pPr>
       <w:r>
-        <w:t>6. Pruebas y resultados</w:t>
+        <w:t>7. Pruebas y resultados</w:t>
       </w:r>
     </w:p>
     <w:p>
       <w:r>
         <w:t>Se ejecutaron npm test y npm run lint en Node 24.15.0. Resultado registrado: 17 pruebas aprobadas y lint sin errores. Las pruebas cubren ajuste de trazos, reglas de ruta, reconocimiento de formas, matrices, clipping y colisiones. Una prueba manual en Chrome verificó que el arrastre de la escena de área construye 40 u × 30 u = 1200 u² y que la interfaz no emite errores de página. También se generó una copia HTML autónoma.</w:t>
+      </w:r>
+    </w:p>
+    <w:p>
+      <w:r>
+        <w:t>Tabla 2. Verificación funcional. Fuente: ejecución local del proyecto, 20/10/2026.</w:t>
       </w:r>
     </w:p>
     <w:tbl>
@@ -755,16 +785,154 @@
       </w:r>
     </w:p>
     <w:p>
-      <w:pPr>
-        <w:pStyle w:val="Heading1"/>
-      </w:pPr>
       <w:r>
-        <w:t>7. Discusión</w:t>
+        <w:t>Tabla 3. Tiempo local de 100 000 llamadas en Node 24.15.0, mediana de cinco rondas tras calentamiento. Fuente: scripts/bench-graphics.mjs y benchmark_local.json.</w:t>
       </w:r>
     </w:p>
+    <w:tbl>
+      <w:tblPr>
+        <w:tblStyle w:val="TableGrid"/>
+        <w:tblW w:type="auto" w:w="0"/>
+        <w:jc w:val="center"/>
+        <w:tblLook w:firstColumn="1" w:firstRow="1" w:lastColumn="0" w:lastRow="0" w:noHBand="0" w:noVBand="1" w:val="04A0"/>
+      </w:tblPr>
+      <w:tblGrid>
+        <w:gridCol w:w="3024"/>
+        <w:gridCol w:w="3024"/>
+        <w:gridCol w:w="3024"/>
+      </w:tblGrid>
+      <w:tr>
+        <w:tc>
+          <w:tcPr>
+            <w:tcW w:type="dxa" w:w="3024"/>
+          </w:tcPr>
+          <w:p>
+            <w:r>
+              <w:t>Operación</w:t>
+            </w:r>
+          </w:p>
+        </w:tc>
+        <w:tc>
+          <w:tcPr>
+            <w:tcW w:type="dxa" w:w="3024"/>
+          </w:tcPr>
+          <w:p>
+            <w:r>
+              <w:t>Tiempo</w:t>
+            </w:r>
+          </w:p>
+        </w:tc>
+        <w:tc>
+          <w:tcPr>
+            <w:tcW w:type="dxa" w:w="3024"/>
+          </w:tcPr>
+          <w:p>
+            <w:r>
+              <w:t>Alcance</w:t>
+            </w:r>
+          </w:p>
+        </w:tc>
+      </w:tr>
+      <w:tr>
+        <w:tc>
+          <w:tcPr>
+            <w:tcW w:type="dxa" w:w="3024"/>
+          </w:tcPr>
+          <w:p>
+            <w:r>
+              <w:t>Matriz 3×3 y punto</w:t>
+            </w:r>
+          </w:p>
+        </w:tc>
+        <w:tc>
+          <w:tcPr>
+            <w:tcW w:type="dxa" w:w="3024"/>
+          </w:tcPr>
+          <w:p>
+            <w:r>
+              <w:t>13.75 ms</w:t>
+            </w:r>
+          </w:p>
+        </w:tc>
+        <w:tc>
+          <w:tcPr>
+            <w:tcW w:type="dxa" w:w="3024"/>
+          </w:tcPr>
+          <w:p>
+            <w:r>
+              <w:t>Sin SVG</w:t>
+            </w:r>
+          </w:p>
+        </w:tc>
+      </w:tr>
+      <w:tr>
+        <w:tc>
+          <w:tcPr>
+            <w:tcW w:type="dxa" w:w="3024"/>
+          </w:tcPr>
+          <w:p>
+            <w:r>
+              <w:t>Clipping de segmento</w:t>
+            </w:r>
+          </w:p>
+        </w:tc>
+        <w:tc>
+          <w:tcPr>
+            <w:tcW w:type="dxa" w:w="3024"/>
+          </w:tcPr>
+          <w:p>
+            <w:r>
+              <w:t>5.02 ms</w:t>
+            </w:r>
+          </w:p>
+        </w:tc>
+        <w:tc>
+          <w:tcPr>
+            <w:tcW w:type="dxa" w:w="3024"/>
+          </w:tcPr>
+          <w:p>
+            <w:r>
+              <w:t>Sin renderizado</w:t>
+            </w:r>
+          </w:p>
+        </w:tc>
+      </w:tr>
+      <w:tr>
+        <w:tc>
+          <w:tcPr>
+            <w:tcW w:type="dxa" w:w="3024"/>
+          </w:tcPr>
+          <w:p>
+            <w:r>
+              <w:t>Intersección de segmentos</w:t>
+            </w:r>
+          </w:p>
+        </w:tc>
+        <w:tc>
+          <w:tcPr>
+            <w:tcW w:type="dxa" w:w="3024"/>
+          </w:tcPr>
+          <w:p>
+            <w:r>
+              <w:t>1.92 ms</w:t>
+            </w:r>
+          </w:p>
+        </w:tc>
+        <w:tc>
+          <w:tcPr>
+            <w:tcW w:type="dxa" w:w="3024"/>
+          </w:tcPr>
+          <w:p>
+            <w:r>
+              <w:t>Sin FPS</w:t>
+            </w:r>
+          </w:p>
+        </w:tc>
+      </w:tr>
+    </w:tbl>
     <w:p>
       <w:r>
-        <w:t>La versión actual hace que una decisión geométrica cause un resultado jugable y mantiene el acceso libre a todas las escenas para la demostración. La escena de área es la más sencilla de explicar en público porque se puede anticipar 40 × 30 y comprobar el efecto en la balanza. El valor didáctico observado aquí es de diseño e interacción; aún falta una evaluación con estudiantes que compare comprensión antes y después de jugar.</w:t>
+        <w:t>Estos tiempos de algoritmos excluyen renderizado y no representan FPS del juego ni del Laboratorio 05.</w:t>
       </w:r>
     </w:p>
     <w:p>
@@ -783,6 +951,11 @@
     <w:p>
       <w:r>
         <w:t>La actividad fue una demostración interactiva; las evidencias recibidas no contienen una evaluación pre y post ni permiten inferir un efecto causal en el aprendizaje. Se propone una sesión posterior con dos problemas equivalentes, una rúbrica de explicación de medidas y registro anónimo de intentos.</w:t>
+      </w:r>
+    </w:p>
+    <w:p>
+      <w:r>
+        <w:t>Ética y uso responsable: el juego no recopila datos personales. Las capturas del expediente muestran al expositor y usan códigos para los alumnos; cualquier autorización familiar original debe conservarse de forma privada. Los recursos visuales y tipográficos se documentan en ARTE_GENERADO.md y THIRD_PARTY_NOTICES.md.</w:t>
       </w:r>
     </w:p>
     <w:p>
@@ -12950,6 +13123,16 @@
         <w:shd w:val="clear" w:color="auto" w:fill="FBCAA2" w:themeFill="accent6" w:themeFillTint="7F"/>
       </w:tcPr>
     </w:tblStylePr>
+  </w:style>
+  <w:style w:type="paragraph" w:customStyle="1" w:styleId="Code">
+    <w:name w:val="Code"/>
+    <w:pPr>
+      <w:spacing w:after="120" w:line="252" w:lineRule="auto"/>
+    </w:pPr>
+    <w:rPr>
+      <w:rFonts w:ascii="Consolas" w:hAnsi="Consolas"/>
+      <w:sz w:val="17"/>
+    </w:rPr>
   </w:style>
 </w:styles>
 </file>

</xml_diff>